<commit_message>
Add public api: getCounterAttackTotalDamage(damageType)
</commit_message>
<xml_diff>
--- a/兵种.docx
+++ b/兵种.docx
@@ -24,7 +24,7 @@
       <w:pPr>
         <w:spacing w:after="0" w:line="240" w:lineRule="auto"/>
         <w:rPr>
-          <w:rFonts w:asciiTheme="minorEastAsia" w:hAnsiTheme="minorEastAsia" w:hint="eastAsia"/>
+          <w:rFonts w:asciiTheme="minorEastAsia" w:hAnsiTheme="minorEastAsia"/>
           <w:sz w:val="18"/>
           <w:szCs w:val="18"/>
         </w:rPr>
@@ -107,7 +107,7 @@
               <w:widowControl/>
               <w:jc w:val="left"/>
               <w:rPr>
-                <w:rFonts w:asciiTheme="minorEastAsia" w:hAnsiTheme="minorEastAsia" w:cs="Times New Roman" w:hint="eastAsia"/>
+                <w:rFonts w:asciiTheme="minorEastAsia" w:hAnsiTheme="minorEastAsia" w:cs="Times New Roman"/>
                 <w:color w:val="000000"/>
                 <w:sz w:val="18"/>
                 <w:szCs w:val="18"/>
@@ -177,7 +177,7 @@
               <w:widowControl/>
               <w:jc w:val="left"/>
               <w:rPr>
-                <w:rFonts w:asciiTheme="minorEastAsia" w:hAnsiTheme="minorEastAsia" w:cs="Times New Roman" w:hint="eastAsia"/>
+                <w:rFonts w:asciiTheme="minorEastAsia" w:hAnsiTheme="minorEastAsia" w:cs="Times New Roman"/>
                 <w:color w:val="000000"/>
                 <w:sz w:val="18"/>
                 <w:szCs w:val="18"/>
@@ -258,16 +258,25 @@
                 <w:sz w:val="18"/>
                 <w:szCs w:val="18"/>
               </w:rPr>
-              <w:t>攻击3</w:t>
-            </w:r>
-            <w:r>
-              <w:rPr>
-                <w:rFonts w:asciiTheme="minorEastAsia" w:hAnsiTheme="minorEastAsia" w:cs="Times New Roman"/>
-                <w:color w:val="000000"/>
-                <w:sz w:val="18"/>
-                <w:szCs w:val="18"/>
-              </w:rPr>
-              <w:t>6</w:t>
+              <w:t>攻击</w:t>
+            </w:r>
+            <w:r>
+              <w:rPr>
+                <w:rFonts w:asciiTheme="minorEastAsia" w:hAnsiTheme="minorEastAsia" w:cs="Times New Roman" w:hint="eastAsia"/>
+                <w:color w:val="000000"/>
+                <w:sz w:val="18"/>
+                <w:szCs w:val="18"/>
+              </w:rPr>
+              <w:t>3</w:t>
+            </w:r>
+            <w:r>
+              <w:rPr>
+                <w:rFonts w:asciiTheme="minorEastAsia" w:hAnsiTheme="minorEastAsia" w:cs="Times New Roman"/>
+                <w:color w:val="000000"/>
+                <w:sz w:val="18"/>
+                <w:szCs w:val="18"/>
+              </w:rPr>
+              <w:t>2</w:t>
             </w:r>
             <w:r>
               <w:rPr>
@@ -378,16 +387,16 @@
                 <w:sz w:val="18"/>
                 <w:szCs w:val="18"/>
               </w:rPr>
-              <w:t>3</w:t>
-            </w:r>
-            <w:r>
-              <w:rPr>
-                <w:rFonts w:asciiTheme="minorEastAsia" w:hAnsiTheme="minorEastAsia" w:cs="Times New Roman"/>
-                <w:color w:val="000000"/>
-                <w:sz w:val="18"/>
-                <w:szCs w:val="18"/>
-              </w:rPr>
               <w:t>2</w:t>
+            </w:r>
+            <w:r>
+              <w:rPr>
+                <w:rFonts w:asciiTheme="minorEastAsia" w:hAnsiTheme="minorEastAsia" w:cs="Times New Roman"/>
+                <w:color w:val="000000"/>
+                <w:sz w:val="18"/>
+                <w:szCs w:val="18"/>
+              </w:rPr>
+              <w:t>4</w:t>
             </w:r>
             <w:r>
               <w:rPr>
@@ -732,7 +741,7 @@
               <w:widowControl/>
               <w:jc w:val="left"/>
               <w:rPr>
-                <w:rFonts w:asciiTheme="minorEastAsia" w:hAnsiTheme="minorEastAsia" w:cs="Times New Roman" w:hint="eastAsia"/>
+                <w:rFonts w:asciiTheme="minorEastAsia" w:hAnsiTheme="minorEastAsia" w:cs="Times New Roman"/>
                 <w:color w:val="000000"/>
                 <w:sz w:val="18"/>
                 <w:szCs w:val="18"/>
@@ -905,7 +914,7 @@
             </w:r>
             <w:r>
               <w:rPr>
-                <w:rFonts w:asciiTheme="minorEastAsia" w:hAnsiTheme="minorEastAsia" w:cs="Times New Roman" w:hint="eastAsia"/>
+                <w:rFonts w:asciiTheme="minorEastAsia" w:hAnsiTheme="minorEastAsia" w:cs="Times New Roman"/>
                 <w:color w:val="000000"/>
                 <w:sz w:val="18"/>
                 <w:szCs w:val="18"/>
@@ -1021,7 +1030,7 @@
                 <w:sz w:val="18"/>
                 <w:szCs w:val="18"/>
               </w:rPr>
-              <w:t>4</w:t>
+              <w:t>0</w:t>
             </w:r>
             <w:r>
               <w:rPr>
@@ -1411,7 +1420,7 @@
               <w:widowControl/>
               <w:jc w:val="left"/>
               <w:rPr>
-                <w:rFonts w:asciiTheme="minorEastAsia" w:hAnsiTheme="minorEastAsia" w:cs="Times New Roman" w:hint="eastAsia"/>
+                <w:rFonts w:asciiTheme="minorEastAsia" w:hAnsiTheme="minorEastAsia" w:cs="Times New Roman"/>
                 <w:color w:val="000000"/>
                 <w:sz w:val="18"/>
                 <w:szCs w:val="18"/>
@@ -1606,7 +1615,7 @@
               <w:widowControl/>
               <w:jc w:val="left"/>
               <w:rPr>
-                <w:rFonts w:asciiTheme="minorEastAsia" w:hAnsiTheme="minorEastAsia" w:cs="Times New Roman" w:hint="eastAsia"/>
+                <w:rFonts w:asciiTheme="minorEastAsia" w:hAnsiTheme="minorEastAsia" w:cs="Times New Roman"/>
                 <w:color w:val="000000"/>
                 <w:sz w:val="18"/>
                 <w:szCs w:val="18"/>
@@ -1978,7 +1987,7 @@
               <w:widowControl/>
               <w:jc w:val="left"/>
               <w:rPr>
-                <w:rFonts w:asciiTheme="minorEastAsia" w:hAnsiTheme="minorEastAsia" w:cs="Times New Roman" w:hint="eastAsia"/>
+                <w:rFonts w:asciiTheme="minorEastAsia" w:hAnsiTheme="minorEastAsia" w:cs="Times New Roman"/>
                 <w:color w:val="000000"/>
                 <w:sz w:val="18"/>
                 <w:szCs w:val="18"/>
@@ -2525,7 +2534,7 @@
               <w:widowControl/>
               <w:jc w:val="left"/>
               <w:rPr>
-                <w:rFonts w:asciiTheme="minorEastAsia" w:hAnsiTheme="minorEastAsia" w:cs="Times New Roman" w:hint="eastAsia"/>
+                <w:rFonts w:asciiTheme="minorEastAsia" w:hAnsiTheme="minorEastAsia" w:cs="Times New Roman"/>
                 <w:color w:val="000000"/>
                 <w:sz w:val="18"/>
                 <w:szCs w:val="18"/>
@@ -3081,7 +3090,7 @@
               <w:widowControl/>
               <w:jc w:val="left"/>
               <w:rPr>
-                <w:rFonts w:asciiTheme="minorEastAsia" w:hAnsiTheme="minorEastAsia" w:cs="Times New Roman" w:hint="eastAsia"/>
+                <w:rFonts w:asciiTheme="minorEastAsia" w:hAnsiTheme="minorEastAsia" w:cs="Times New Roman"/>
                 <w:color w:val="000000"/>
                 <w:sz w:val="18"/>
                 <w:szCs w:val="18"/>
@@ -3583,7 +3592,7 @@
               <w:widowControl/>
               <w:jc w:val="center"/>
               <w:rPr>
-                <w:rFonts w:asciiTheme="minorEastAsia" w:hAnsiTheme="minorEastAsia" w:cs="Times New Roman" w:hint="eastAsia"/>
+                <w:rFonts w:asciiTheme="minorEastAsia" w:hAnsiTheme="minorEastAsia" w:cs="Times New Roman"/>
                 <w:b/>
                 <w:bCs/>
                 <w:color w:val="000000"/>
@@ -3616,7 +3625,7 @@
               <w:widowControl/>
               <w:jc w:val="left"/>
               <w:rPr>
-                <w:rFonts w:asciiTheme="minorEastAsia" w:hAnsiTheme="minorEastAsia" w:cs="Times New Roman" w:hint="eastAsia"/>
+                <w:rFonts w:asciiTheme="minorEastAsia" w:hAnsiTheme="minorEastAsia" w:cs="Times New Roman"/>
                 <w:color w:val="000000"/>
                 <w:sz w:val="18"/>
                 <w:szCs w:val="18"/>
@@ -4097,7 +4106,7 @@
               <w:widowControl/>
               <w:jc w:val="left"/>
               <w:rPr>
-                <w:rFonts w:asciiTheme="minorEastAsia" w:hAnsiTheme="minorEastAsia" w:cs="Times New Roman" w:hint="eastAsia"/>
+                <w:rFonts w:asciiTheme="minorEastAsia" w:hAnsiTheme="minorEastAsia" w:cs="Times New Roman"/>
                 <w:color w:val="000000"/>
                 <w:sz w:val="18"/>
                 <w:szCs w:val="18"/>
@@ -4753,7 +4762,7 @@
               <w:widowControl/>
               <w:jc w:val="left"/>
               <w:rPr>
-                <w:rFonts w:asciiTheme="minorEastAsia" w:hAnsiTheme="minorEastAsia" w:cs="Times New Roman" w:hint="eastAsia"/>
+                <w:rFonts w:asciiTheme="minorEastAsia" w:hAnsiTheme="minorEastAsia" w:cs="Times New Roman"/>
                 <w:color w:val="000000"/>
                 <w:sz w:val="18"/>
                 <w:szCs w:val="18"/>
@@ -5133,7 +5142,7 @@
               <w:widowControl/>
               <w:jc w:val="left"/>
               <w:rPr>
-                <w:rFonts w:asciiTheme="minorEastAsia" w:hAnsiTheme="minorEastAsia" w:cs="Times New Roman" w:hint="eastAsia"/>
+                <w:rFonts w:asciiTheme="minorEastAsia" w:hAnsiTheme="minorEastAsia" w:cs="Times New Roman"/>
                 <w:color w:val="000000"/>
                 <w:sz w:val="18"/>
                 <w:szCs w:val="18"/>
@@ -5513,7 +5522,7 @@
               <w:widowControl/>
               <w:jc w:val="left"/>
               <w:rPr>
-                <w:rFonts w:asciiTheme="minorEastAsia" w:hAnsiTheme="minorEastAsia" w:cs="Times New Roman" w:hint="eastAsia"/>
+                <w:rFonts w:asciiTheme="minorEastAsia" w:hAnsiTheme="minorEastAsia" w:cs="Times New Roman"/>
                 <w:color w:val="000000"/>
                 <w:sz w:val="18"/>
                 <w:szCs w:val="18"/>

</xml_diff>

<commit_message>
Complete empireArm: SteamTank; Test single unit arm
</commit_message>
<xml_diff>
--- a/兵种.docx
+++ b/兵种.docx
@@ -4584,6 +4584,523 @@
                 <w:szCs w:val="18"/>
               </w:rPr>
               <w:t>2</w:t>
+            </w:r>
+          </w:p>
+        </w:tc>
+        <w:tc>
+          <w:tcPr>
+            <w:tcW w:w="5193" w:type="dxa"/>
+            <w:vMerge/>
+            <w:hideMark/>
+          </w:tcPr>
+          <w:p>
+            <w:pPr>
+              <w:widowControl/>
+              <w:jc w:val="left"/>
+              <w:rPr>
+                <w:rFonts w:asciiTheme="minorEastAsia" w:hAnsiTheme="minorEastAsia" w:cs="Times New Roman"/>
+                <w:color w:val="000000"/>
+                <w:sz w:val="18"/>
+                <w:szCs w:val="18"/>
+              </w:rPr>
+            </w:pPr>
+          </w:p>
+        </w:tc>
+      </w:tr>
+    </w:tbl>
+    <w:p>
+      <w:pPr>
+        <w:spacing w:after="0" w:line="240" w:lineRule="auto"/>
+        <w:rPr>
+          <w:rFonts w:asciiTheme="minorEastAsia" w:hAnsiTheme="minorEastAsia"/>
+          <w:sz w:val="18"/>
+          <w:szCs w:val="18"/>
+        </w:rPr>
+      </w:pPr>
+    </w:p>
+    <w:tbl>
+      <w:tblPr>
+        <w:tblStyle w:val="TableGrid"/>
+        <w:tblW w:w="10768" w:type="dxa"/>
+        <w:tblLook w:val="04A0" w:firstRow="1" w:lastRow="0" w:firstColumn="1" w:lastColumn="0" w:noHBand="0" w:noVBand="1"/>
+      </w:tblPr>
+      <w:tblGrid>
+        <w:gridCol w:w="2056"/>
+        <w:gridCol w:w="3519"/>
+        <w:gridCol w:w="5193"/>
+      </w:tblGrid>
+      <w:tr>
+        <w:trPr>
+          <w:trHeight w:val="270"/>
+        </w:trPr>
+        <w:tc>
+          <w:tcPr>
+            <w:tcW w:w="2056" w:type="dxa"/>
+            <w:noWrap/>
+            <w:hideMark/>
+          </w:tcPr>
+          <w:p>
+            <w:pPr>
+              <w:widowControl/>
+              <w:jc w:val="center"/>
+              <w:rPr>
+                <w:rFonts w:asciiTheme="minorEastAsia" w:hAnsiTheme="minorEastAsia" w:cs="Times New Roman" w:hint="eastAsia"/>
+                <w:b/>
+                <w:bCs/>
+                <w:color w:val="000000"/>
+                <w:sz w:val="18"/>
+                <w:szCs w:val="18"/>
+              </w:rPr>
+            </w:pPr>
+            <w:r>
+              <w:rPr>
+                <w:rFonts w:asciiTheme="minorEastAsia" w:hAnsiTheme="minorEastAsia" w:cs="Times New Roman" w:hint="eastAsia"/>
+                <w:b/>
+                <w:bCs/>
+                <w:color w:val="000000"/>
+                <w:sz w:val="18"/>
+                <w:szCs w:val="18"/>
+              </w:rPr>
+              <w:t>蒸汽坦克</w:t>
+            </w:r>
+          </w:p>
+        </w:tc>
+        <w:tc>
+          <w:tcPr>
+            <w:tcW w:w="8712" w:type="dxa"/>
+            <w:gridSpan w:val="2"/>
+            <w:noWrap/>
+            <w:hideMark/>
+          </w:tcPr>
+          <w:p>
+            <w:pPr>
+              <w:widowControl/>
+              <w:jc w:val="left"/>
+              <w:rPr>
+                <w:rFonts w:asciiTheme="minorEastAsia" w:hAnsiTheme="minorEastAsia" w:cs="Times New Roman"/>
+                <w:color w:val="000000"/>
+                <w:sz w:val="18"/>
+                <w:szCs w:val="18"/>
+              </w:rPr>
+            </w:pPr>
+            <w:r>
+              <w:rPr>
+                <w:rFonts w:asciiTheme="minorEastAsia" w:hAnsiTheme="minorEastAsia" w:cs="Times New Roman" w:hint="eastAsia"/>
+                <w:color w:val="000000"/>
+                <w:sz w:val="18"/>
+                <w:szCs w:val="18"/>
+              </w:rPr>
+              <w:t>单体-装甲车</w:t>
+            </w:r>
+            <w:r>
+              <w:rPr>
+                <w:rFonts w:asciiTheme="minorEastAsia" w:hAnsiTheme="minorEastAsia" w:cs="Times New Roman" w:hint="eastAsia"/>
+                <w:color w:val="000000"/>
+                <w:sz w:val="18"/>
+                <w:szCs w:val="18"/>
+              </w:rPr>
+              <w:t>（</w:t>
+            </w:r>
+            <w:r>
+              <w:rPr>
+                <w:rFonts w:asciiTheme="minorEastAsia" w:hAnsiTheme="minorEastAsia" w:cs="Times New Roman" w:hint="eastAsia"/>
+                <w:color w:val="000000"/>
+                <w:sz w:val="18"/>
+                <w:szCs w:val="18"/>
+              </w:rPr>
+              <w:t>6</w:t>
+            </w:r>
+            <w:r>
+              <w:rPr>
+                <w:rFonts w:asciiTheme="minorEastAsia" w:hAnsiTheme="minorEastAsia" w:cs="Times New Roman" w:hint="eastAsia"/>
+                <w:color w:val="000000"/>
+                <w:sz w:val="18"/>
+                <w:szCs w:val="18"/>
+              </w:rPr>
+              <w:t>G）</w:t>
+            </w:r>
+          </w:p>
+        </w:tc>
+      </w:tr>
+      <w:tr>
+        <w:trPr>
+          <w:trHeight w:val="113"/>
+        </w:trPr>
+        <w:tc>
+          <w:tcPr>
+            <w:tcW w:w="2056" w:type="dxa"/>
+            <w:vMerge w:val="restart"/>
+            <w:noWrap/>
+            <w:hideMark/>
+          </w:tcPr>
+          <w:p>
+            <w:pPr>
+              <w:widowControl/>
+              <w:jc w:val="left"/>
+              <w:rPr>
+                <w:rFonts w:asciiTheme="minorEastAsia" w:hAnsiTheme="minorEastAsia" w:cs="Times New Roman"/>
+                <w:color w:val="000000"/>
+                <w:sz w:val="18"/>
+                <w:szCs w:val="18"/>
+              </w:rPr>
+            </w:pPr>
+          </w:p>
+        </w:tc>
+        <w:tc>
+          <w:tcPr>
+            <w:tcW w:w="3519" w:type="dxa"/>
+            <w:noWrap/>
+            <w:vAlign w:val="center"/>
+            <w:hideMark/>
+          </w:tcPr>
+          <w:p>
+            <w:pPr>
+              <w:widowControl/>
+              <w:jc w:val="left"/>
+              <w:rPr>
+                <w:rFonts w:asciiTheme="minorEastAsia" w:hAnsiTheme="minorEastAsia" w:cs="Times New Roman"/>
+                <w:color w:val="000000"/>
+                <w:sz w:val="18"/>
+                <w:szCs w:val="18"/>
+              </w:rPr>
+            </w:pPr>
+            <w:r>
+              <w:rPr>
+                <w:rFonts w:asciiTheme="minorEastAsia" w:hAnsiTheme="minorEastAsia" w:cs="Times New Roman" w:hint="eastAsia"/>
+                <w:color w:val="000000"/>
+                <w:sz w:val="18"/>
+                <w:szCs w:val="18"/>
+              </w:rPr>
+              <w:t>单体生命</w:t>
+            </w:r>
+            <w:r>
+              <w:rPr>
+                <w:rFonts w:asciiTheme="minorEastAsia" w:hAnsiTheme="minorEastAsia" w:cs="Times New Roman" w:hint="eastAsia"/>
+                <w:color w:val="000000"/>
+                <w:sz w:val="18"/>
+                <w:szCs w:val="18"/>
+              </w:rPr>
+              <w:t>3</w:t>
+            </w:r>
+            <w:r>
+              <w:rPr>
+                <w:rFonts w:asciiTheme="minorEastAsia" w:hAnsiTheme="minorEastAsia" w:cs="Times New Roman"/>
+                <w:color w:val="000000"/>
+                <w:sz w:val="18"/>
+                <w:szCs w:val="18"/>
+              </w:rPr>
+              <w:t>00</w:t>
+            </w:r>
+          </w:p>
+        </w:tc>
+        <w:tc>
+          <w:tcPr>
+            <w:tcW w:w="5193" w:type="dxa"/>
+            <w:vMerge w:val="restart"/>
+            <w:noWrap/>
+            <w:vAlign w:val="center"/>
+            <w:hideMark/>
+          </w:tcPr>
+          <w:p>
+            <w:pPr>
+              <w:widowControl/>
+              <w:jc w:val="left"/>
+              <w:rPr>
+                <w:rFonts w:asciiTheme="minorEastAsia" w:hAnsiTheme="minorEastAsia" w:cs="Times New Roman"/>
+                <w:color w:val="000000"/>
+                <w:sz w:val="18"/>
+                <w:szCs w:val="18"/>
+              </w:rPr>
+            </w:pPr>
+            <w:r>
+              <w:rPr>
+                <w:rFonts w:asciiTheme="minorEastAsia" w:hAnsiTheme="minorEastAsia" w:cs="Times New Roman" w:hint="eastAsia"/>
+                <w:color w:val="000000"/>
+                <w:sz w:val="18"/>
+                <w:szCs w:val="18"/>
+              </w:rPr>
+              <w:t>攻击</w:t>
+            </w:r>
+            <w:r>
+              <w:rPr>
+                <w:rFonts w:asciiTheme="minorEastAsia" w:hAnsiTheme="minorEastAsia" w:cs="Times New Roman" w:hint="eastAsia"/>
+                <w:color w:val="000000"/>
+                <w:sz w:val="18"/>
+                <w:szCs w:val="18"/>
+              </w:rPr>
+              <w:t>150</w:t>
+            </w:r>
+            <w:r>
+              <w:rPr>
+                <w:rFonts w:asciiTheme="minorEastAsia" w:hAnsiTheme="minorEastAsia" w:cs="Times New Roman"/>
+                <w:color w:val="000000"/>
+                <w:sz w:val="18"/>
+                <w:szCs w:val="18"/>
+              </w:rPr>
+              <w:t xml:space="preserve">  </w:t>
+            </w:r>
+            <w:r>
+              <w:rPr>
+                <w:rFonts w:asciiTheme="minorEastAsia" w:hAnsiTheme="minorEastAsia" w:cs="Times New Roman" w:hint="eastAsia"/>
+                <w:color w:val="000000"/>
+                <w:sz w:val="18"/>
+                <w:szCs w:val="18"/>
+              </w:rPr>
+              <w:t>范围12</w:t>
+            </w:r>
+            <w:r>
+              <w:rPr>
+                <w:rFonts w:asciiTheme="minorEastAsia" w:hAnsiTheme="minorEastAsia" w:cs="Times New Roman"/>
+                <w:color w:val="000000"/>
+                <w:sz w:val="18"/>
+                <w:szCs w:val="18"/>
+              </w:rPr>
+              <w:t xml:space="preserve">  </w:t>
+            </w:r>
+            <w:r>
+              <w:rPr>
+                <w:rFonts w:asciiTheme="minorEastAsia" w:hAnsiTheme="minorEastAsia" w:cs="Times New Roman" w:hint="eastAsia"/>
+                <w:color w:val="000000"/>
+                <w:sz w:val="18"/>
+                <w:szCs w:val="18"/>
+              </w:rPr>
+              <w:t>破甲50</w:t>
+            </w:r>
+          </w:p>
+          <w:p>
+            <w:pPr>
+              <w:widowControl/>
+              <w:jc w:val="left"/>
+              <w:rPr>
+                <w:rFonts w:asciiTheme="minorEastAsia" w:hAnsiTheme="minorEastAsia" w:cs="Times New Roman"/>
+                <w:color w:val="000000"/>
+                <w:sz w:val="18"/>
+                <w:szCs w:val="18"/>
+              </w:rPr>
+            </w:pPr>
+          </w:p>
+        </w:tc>
+      </w:tr>
+      <w:tr>
+        <w:trPr>
+          <w:trHeight w:val="112"/>
+        </w:trPr>
+        <w:tc>
+          <w:tcPr>
+            <w:tcW w:w="2056" w:type="dxa"/>
+            <w:vMerge/>
+            <w:noWrap/>
+          </w:tcPr>
+          <w:p>
+            <w:pPr>
+              <w:widowControl/>
+              <w:jc w:val="left"/>
+              <w:rPr>
+                <w:rFonts w:asciiTheme="minorEastAsia" w:hAnsiTheme="minorEastAsia" w:cs="Times New Roman"/>
+                <w:color w:val="000000"/>
+                <w:sz w:val="18"/>
+                <w:szCs w:val="18"/>
+              </w:rPr>
+            </w:pPr>
+          </w:p>
+        </w:tc>
+        <w:tc>
+          <w:tcPr>
+            <w:tcW w:w="3519" w:type="dxa"/>
+            <w:noWrap/>
+            <w:vAlign w:val="center"/>
+          </w:tcPr>
+          <w:p>
+            <w:pPr>
+              <w:widowControl/>
+              <w:jc w:val="left"/>
+              <w:rPr>
+                <w:rFonts w:asciiTheme="minorEastAsia" w:hAnsiTheme="minorEastAsia" w:cs="Times New Roman"/>
+                <w:color w:val="000000"/>
+                <w:sz w:val="18"/>
+                <w:szCs w:val="18"/>
+              </w:rPr>
+            </w:pPr>
+            <w:r>
+              <w:rPr>
+                <w:rFonts w:asciiTheme="minorEastAsia" w:hAnsiTheme="minorEastAsia" w:cs="Times New Roman" w:hint="eastAsia"/>
+                <w:color w:val="000000"/>
+                <w:sz w:val="18"/>
+                <w:szCs w:val="18"/>
+              </w:rPr>
+              <w:t>护甲/闪避：近战</w:t>
+            </w:r>
+            <w:r>
+              <w:rPr>
+                <w:rFonts w:asciiTheme="minorEastAsia" w:hAnsiTheme="minorEastAsia" w:cs="Times New Roman" w:hint="eastAsia"/>
+                <w:color w:val="000000"/>
+                <w:sz w:val="18"/>
+                <w:szCs w:val="18"/>
+              </w:rPr>
+              <w:t>9</w:t>
+            </w:r>
+            <w:r>
+              <w:rPr>
+                <w:rFonts w:asciiTheme="minorEastAsia" w:hAnsiTheme="minorEastAsia" w:cs="Times New Roman"/>
+                <w:color w:val="000000"/>
+                <w:sz w:val="18"/>
+                <w:szCs w:val="18"/>
+              </w:rPr>
+              <w:t>0</w:t>
+            </w:r>
+            <w:r>
+              <w:rPr>
+                <w:rFonts w:asciiTheme="minorEastAsia" w:hAnsiTheme="minorEastAsia" w:cs="Times New Roman"/>
+                <w:color w:val="000000"/>
+                <w:sz w:val="18"/>
+                <w:szCs w:val="18"/>
+              </w:rPr>
+              <w:t xml:space="preserve">  </w:t>
+            </w:r>
+            <w:r>
+              <w:rPr>
+                <w:rFonts w:asciiTheme="minorEastAsia" w:hAnsiTheme="minorEastAsia" w:cs="Times New Roman" w:hint="eastAsia"/>
+                <w:color w:val="000000"/>
+                <w:sz w:val="18"/>
+                <w:szCs w:val="18"/>
+              </w:rPr>
+              <w:t>远程</w:t>
+            </w:r>
+            <w:r>
+              <w:rPr>
+                <w:rFonts w:asciiTheme="minorEastAsia" w:hAnsiTheme="minorEastAsia" w:cs="Times New Roman" w:hint="eastAsia"/>
+                <w:color w:val="000000"/>
+                <w:sz w:val="18"/>
+                <w:szCs w:val="18"/>
+              </w:rPr>
+              <w:t>9</w:t>
+            </w:r>
+            <w:r>
+              <w:rPr>
+                <w:rFonts w:asciiTheme="minorEastAsia" w:hAnsiTheme="minorEastAsia" w:cs="Times New Roman"/>
+                <w:color w:val="000000"/>
+                <w:sz w:val="18"/>
+                <w:szCs w:val="18"/>
+              </w:rPr>
+              <w:t>0</w:t>
+            </w:r>
+            <w:r>
+              <w:rPr>
+                <w:rFonts w:asciiTheme="minorEastAsia" w:hAnsiTheme="minorEastAsia" w:cs="Times New Roman"/>
+                <w:color w:val="000000"/>
+                <w:sz w:val="18"/>
+                <w:szCs w:val="18"/>
+              </w:rPr>
+              <w:t xml:space="preserve">  </w:t>
+            </w:r>
+            <w:r>
+              <w:rPr>
+                <w:rFonts w:asciiTheme="minorEastAsia" w:hAnsiTheme="minorEastAsia" w:cs="Times New Roman" w:hint="eastAsia"/>
+                <w:color w:val="000000"/>
+                <w:sz w:val="18"/>
+                <w:szCs w:val="18"/>
+              </w:rPr>
+              <w:t>冲杀</w:t>
+            </w:r>
+            <w:r>
+              <w:rPr>
+                <w:rFonts w:asciiTheme="minorEastAsia" w:hAnsiTheme="minorEastAsia" w:cs="Times New Roman" w:hint="eastAsia"/>
+                <w:color w:val="000000"/>
+                <w:sz w:val="18"/>
+                <w:szCs w:val="18"/>
+              </w:rPr>
+              <w:t>9</w:t>
+            </w:r>
+            <w:r>
+              <w:rPr>
+                <w:rFonts w:asciiTheme="minorEastAsia" w:hAnsiTheme="minorEastAsia" w:cs="Times New Roman"/>
+                <w:color w:val="000000"/>
+                <w:sz w:val="18"/>
+                <w:szCs w:val="18"/>
+              </w:rPr>
+              <w:t>0</w:t>
+            </w:r>
+          </w:p>
+        </w:tc>
+        <w:tc>
+          <w:tcPr>
+            <w:tcW w:w="5193" w:type="dxa"/>
+            <w:vMerge/>
+            <w:noWrap/>
+            <w:vAlign w:val="center"/>
+          </w:tcPr>
+          <w:p>
+            <w:pPr>
+              <w:widowControl/>
+              <w:jc w:val="center"/>
+              <w:rPr>
+                <w:rFonts w:asciiTheme="minorEastAsia" w:hAnsiTheme="minorEastAsia" w:cs="Times New Roman"/>
+                <w:color w:val="000000"/>
+                <w:sz w:val="18"/>
+                <w:szCs w:val="18"/>
+              </w:rPr>
+            </w:pPr>
+          </w:p>
+        </w:tc>
+      </w:tr>
+      <w:tr>
+        <w:trPr>
+          <w:trHeight w:val="270"/>
+        </w:trPr>
+        <w:tc>
+          <w:tcPr>
+            <w:tcW w:w="2056" w:type="dxa"/>
+            <w:vMerge/>
+            <w:hideMark/>
+          </w:tcPr>
+          <w:p>
+            <w:pPr>
+              <w:widowControl/>
+              <w:jc w:val="left"/>
+              <w:rPr>
+                <w:rFonts w:asciiTheme="minorEastAsia" w:hAnsiTheme="minorEastAsia" w:cs="Times New Roman"/>
+                <w:color w:val="000000"/>
+                <w:sz w:val="18"/>
+                <w:szCs w:val="18"/>
+              </w:rPr>
+            </w:pPr>
+          </w:p>
+        </w:tc>
+        <w:tc>
+          <w:tcPr>
+            <w:tcW w:w="3519" w:type="dxa"/>
+            <w:noWrap/>
+            <w:vAlign w:val="center"/>
+            <w:hideMark/>
+          </w:tcPr>
+          <w:p>
+            <w:pPr>
+              <w:widowControl/>
+              <w:jc w:val="left"/>
+              <w:rPr>
+                <w:rFonts w:asciiTheme="minorEastAsia" w:hAnsiTheme="minorEastAsia" w:cs="Times New Roman"/>
+                <w:color w:val="000000"/>
+                <w:sz w:val="18"/>
+                <w:szCs w:val="18"/>
+              </w:rPr>
+            </w:pPr>
+            <w:r>
+              <w:rPr>
+                <w:rFonts w:asciiTheme="minorEastAsia" w:hAnsiTheme="minorEastAsia" w:cs="Times New Roman"/>
+                <w:color w:val="000000"/>
+                <w:sz w:val="18"/>
+                <w:szCs w:val="18"/>
+              </w:rPr>
+              <w:t xml:space="preserve">移速 </w:t>
+            </w:r>
+            <w:r>
+              <w:rPr>
+                <w:rFonts w:asciiTheme="minorEastAsia" w:hAnsiTheme="minorEastAsia" w:cs="Times New Roman"/>
+                <w:color w:val="000000"/>
+                <w:sz w:val="18"/>
+                <w:szCs w:val="18"/>
+              </w:rPr>
+              <w:t>3</w:t>
             </w:r>
           </w:p>
         </w:tc>

</xml_diff>

<commit_message>
Use key Q or P to end round
</commit_message>
<xml_diff>
--- a/兵种.docx
+++ b/兵种.docx
@@ -4721,7 +4721,16 @@
                 <w:sz w:val="18"/>
                 <w:szCs w:val="18"/>
               </w:rPr>
-              <w:t>200</w:t>
+              <w:t>3</w:t>
+            </w:r>
+            <w:r>
+              <w:rPr>
+                <w:rFonts w:asciiTheme="minorEastAsia" w:hAnsiTheme="minorEastAsia" w:cs="Times New Roman" w:hint="eastAsia"/>
+                <w:color w:val="000000"/>
+                <w:sz w:val="18"/>
+                <w:szCs w:val="18"/>
+              </w:rPr>
+              <w:t>00</w:t>
             </w:r>
             <w:r>
               <w:rPr>

</xml_diff>

<commit_message>
Sync up data for: empire
</commit_message>
<xml_diff>
--- a/兵种.docx
+++ b/兵种.docx
@@ -2942,7 +2942,25 @@
                 <w:sz w:val="18"/>
                 <w:szCs w:val="18"/>
               </w:rPr>
-              <w:t>破甲8</w:t>
+              <w:t>破甲</w:t>
+            </w:r>
+            <w:r>
+              <w:rPr>
+                <w:rFonts w:asciiTheme="minorEastAsia" w:hAnsiTheme="minorEastAsia" w:cs="Times New Roman" w:hint="eastAsia"/>
+                <w:color w:val="000000"/>
+                <w:sz w:val="18"/>
+                <w:szCs w:val="18"/>
+              </w:rPr>
+              <w:t>1</w:t>
+            </w:r>
+            <w:r>
+              <w:rPr>
+                <w:rFonts w:asciiTheme="minorEastAsia" w:hAnsiTheme="minorEastAsia" w:cs="Times New Roman"/>
+                <w:color w:val="000000"/>
+                <w:sz w:val="18"/>
+                <w:szCs w:val="18"/>
+              </w:rPr>
+              <w:t>6</w:t>
             </w:r>
           </w:p>
           <w:p>
@@ -3392,7 +3410,16 @@
                 <w:sz w:val="18"/>
                 <w:szCs w:val="18"/>
               </w:rPr>
-              <w:t>28</w:t>
+              <w:t>3</w:t>
+            </w:r>
+            <w:r>
+              <w:rPr>
+                <w:rFonts w:asciiTheme="minorEastAsia" w:hAnsiTheme="minorEastAsia" w:cs="Times New Roman"/>
+                <w:color w:val="000000"/>
+                <w:sz w:val="18"/>
+                <w:szCs w:val="18"/>
+              </w:rPr>
+              <w:t>2</w:t>
             </w:r>
             <w:r>
               <w:rPr>
@@ -3476,7 +3503,16 @@
                 <w:sz w:val="18"/>
                 <w:szCs w:val="18"/>
               </w:rPr>
-              <w:t>32</w:t>
+              <w:t>4</w:t>
+            </w:r>
+            <w:r>
+              <w:rPr>
+                <w:rFonts w:asciiTheme="minorEastAsia" w:hAnsiTheme="minorEastAsia" w:cs="Times New Roman"/>
+                <w:color w:val="000000"/>
+                <w:sz w:val="18"/>
+                <w:szCs w:val="18"/>
+              </w:rPr>
+              <w:t>8</w:t>
             </w:r>
             <w:r>
               <w:rPr>
@@ -21598,7 +21634,7 @@
               <w:widowControl/>
               <w:jc w:val="left"/>
               <w:rPr>
-                <w:rFonts w:asciiTheme="minorEastAsia" w:hAnsiTheme="minorEastAsia" w:cs="Times New Roman" w:hint="eastAsia"/>
+                <w:rFonts w:asciiTheme="minorEastAsia" w:hAnsiTheme="minorEastAsia" w:cs="Times New Roman"/>
                 <w:color w:val="000000"/>
                 <w:sz w:val="18"/>
                 <w:szCs w:val="18"/>
@@ -27253,7 +27289,7 @@
               <w:widowControl/>
               <w:jc w:val="left"/>
               <w:rPr>
-                <w:rFonts w:asciiTheme="minorEastAsia" w:hAnsiTheme="minorEastAsia" w:cs="Times New Roman" w:hint="eastAsia"/>
+                <w:rFonts w:asciiTheme="minorEastAsia" w:hAnsiTheme="minorEastAsia" w:cs="Times New Roman"/>
                 <w:color w:val="000000"/>
                 <w:sz w:val="18"/>
                 <w:szCs w:val="18"/>

</xml_diff>

<commit_message>
Sync up data for: nordfort
</commit_message>
<xml_diff>
--- a/兵种.docx
+++ b/兵种.docx
@@ -6647,90 +6647,6 @@
               <w:t>16</w:t>
             </w:r>
           </w:p>
-          <w:p>
-            <w:pPr>
-              <w:widowControl/>
-              <w:jc w:val="left"/>
-              <w:rPr>
-                <w:rFonts w:asciiTheme="minorEastAsia" w:hAnsiTheme="minorEastAsia" w:cs="Times New Roman"/>
-                <w:color w:val="000000"/>
-                <w:sz w:val="18"/>
-                <w:szCs w:val="18"/>
-              </w:rPr>
-            </w:pPr>
-            <w:r>
-              <w:rPr>
-                <w:rFonts w:asciiTheme="minorEastAsia" w:hAnsiTheme="minorEastAsia" w:cs="Times New Roman" w:hint="eastAsia"/>
-                <w:color w:val="000000"/>
-                <w:sz w:val="18"/>
-                <w:szCs w:val="18"/>
-              </w:rPr>
-              <w:t>攻击</w:t>
-            </w:r>
-            <w:r>
-              <w:rPr>
-                <w:rFonts w:asciiTheme="minorEastAsia" w:hAnsiTheme="minorEastAsia" w:cs="Times New Roman" w:hint="eastAsia"/>
-                <w:color w:val="000000"/>
-                <w:sz w:val="18"/>
-                <w:szCs w:val="18"/>
-              </w:rPr>
-              <w:t>42</w:t>
-            </w:r>
-            <w:r>
-              <w:rPr>
-                <w:rFonts w:asciiTheme="minorEastAsia" w:hAnsiTheme="minorEastAsia" w:cs="Times New Roman"/>
-                <w:color w:val="000000"/>
-                <w:sz w:val="18"/>
-                <w:szCs w:val="18"/>
-              </w:rPr>
-              <w:t xml:space="preserve"> </w:t>
-            </w:r>
-            <w:r>
-              <w:rPr>
-                <w:rFonts w:asciiTheme="minorEastAsia" w:hAnsiTheme="minorEastAsia" w:cs="Times New Roman" w:hint="eastAsia"/>
-                <w:color w:val="000000"/>
-                <w:sz w:val="18"/>
-                <w:szCs w:val="18"/>
-              </w:rPr>
-              <w:t>vs</w:t>
-            </w:r>
-            <w:r>
-              <w:rPr>
-                <w:rFonts w:asciiTheme="minorEastAsia" w:hAnsiTheme="minorEastAsia" w:cs="Times New Roman"/>
-                <w:color w:val="000000"/>
-                <w:sz w:val="18"/>
-                <w:szCs w:val="18"/>
-              </w:rPr>
-              <w:t xml:space="preserve"> </w:t>
-            </w:r>
-            <w:r>
-              <w:rPr>
-                <w:rFonts w:asciiTheme="minorEastAsia" w:hAnsiTheme="minorEastAsia" w:cs="Times New Roman" w:hint="eastAsia"/>
-                <w:color w:val="000000"/>
-                <w:sz w:val="18"/>
-                <w:szCs w:val="18"/>
-              </w:rPr>
-              <w:t xml:space="preserve">其他 </w:t>
-            </w:r>
-            <w:r>
-              <w:rPr>
-                <w:rFonts w:asciiTheme="minorEastAsia" w:hAnsiTheme="minorEastAsia" w:cs="Times New Roman"/>
-                <w:color w:val="000000"/>
-                <w:sz w:val="18"/>
-                <w:szCs w:val="18"/>
-              </w:rPr>
-              <w:t xml:space="preserve"> </w:t>
-            </w:r>
-            <w:r>
-              <w:rPr>
-                <w:rFonts w:asciiTheme="minorEastAsia" w:hAnsiTheme="minorEastAsia" w:cs="Times New Roman" w:hint="eastAsia"/>
-                <w:color w:val="000000"/>
-                <w:sz w:val="18"/>
-                <w:szCs w:val="18"/>
-              </w:rPr>
-              <w:t>近战</w:t>
-            </w:r>
-          </w:p>
         </w:tc>
       </w:tr>
       <w:tr>
@@ -8537,7 +8453,16 @@
                 <w:sz w:val="18"/>
                 <w:szCs w:val="18"/>
               </w:rPr>
-              <w:t>36</w:t>
+              <w:t>4</w:t>
+            </w:r>
+            <w:r>
+              <w:rPr>
+                <w:rFonts w:asciiTheme="minorEastAsia" w:hAnsiTheme="minorEastAsia" w:cs="Times New Roman"/>
+                <w:color w:val="000000"/>
+                <w:sz w:val="18"/>
+                <w:szCs w:val="18"/>
+              </w:rPr>
+              <w:t>0</w:t>
             </w:r>
           </w:p>
           <w:p>
@@ -9741,7 +9666,7 @@
                 <w:sz w:val="18"/>
                 <w:szCs w:val="18"/>
               </w:rPr>
-              <w:t>3</w:t>
+              <w:t>6</w:t>
             </w:r>
             <w:r>
               <w:rPr>

</xml_diff>

<commit_message>
Sync up data for: dimwoods
</commit_message>
<xml_diff>
--- a/兵种.docx
+++ b/兵种.docx
@@ -11557,7 +11557,25 @@
                 <w:sz w:val="18"/>
                 <w:szCs w:val="18"/>
               </w:rPr>
-              <w:t>破甲30</w:t>
+              <w:t>破甲</w:t>
+            </w:r>
+            <w:r>
+              <w:rPr>
+                <w:rFonts w:asciiTheme="minorEastAsia" w:hAnsiTheme="minorEastAsia" w:cs="Times New Roman" w:hint="eastAsia"/>
+                <w:color w:val="000000"/>
+                <w:sz w:val="18"/>
+                <w:szCs w:val="18"/>
+              </w:rPr>
+              <w:t>1</w:t>
+            </w:r>
+            <w:r>
+              <w:rPr>
+                <w:rFonts w:asciiTheme="minorEastAsia" w:hAnsiTheme="minorEastAsia" w:cs="Times New Roman" w:hint="eastAsia"/>
+                <w:color w:val="000000"/>
+                <w:sz w:val="18"/>
+                <w:szCs w:val="18"/>
+              </w:rPr>
+              <w:t>0</w:t>
             </w:r>
           </w:p>
         </w:tc>
@@ -11618,7 +11636,7 @@
                 <w:sz w:val="18"/>
                 <w:szCs w:val="18"/>
               </w:rPr>
-              <w:t>50</w:t>
+              <w:t>0</w:t>
             </w:r>
             <w:r>
               <w:rPr>
@@ -12070,7 +12088,16 @@
                 <w:sz w:val="18"/>
                 <w:szCs w:val="18"/>
               </w:rPr>
-              <w:t>60</w:t>
+              <w:t>6</w:t>
+            </w:r>
+            <w:r>
+              <w:rPr>
+                <w:rFonts w:asciiTheme="minorEastAsia" w:hAnsiTheme="minorEastAsia" w:cs="Times New Roman"/>
+                <w:color w:val="000000"/>
+                <w:sz w:val="18"/>
+                <w:szCs w:val="18"/>
+              </w:rPr>
+              <w:t>6</w:t>
             </w:r>
             <w:r>
               <w:rPr>
@@ -12269,7 +12296,7 @@
                 <w:sz w:val="18"/>
                 <w:szCs w:val="18"/>
               </w:rPr>
-              <w:t>5</w:t>
+              <w:t>6</w:t>
             </w:r>
             <w:r>
               <w:rPr>
@@ -12830,7 +12857,7 @@
                 <w:sz w:val="18"/>
                 <w:szCs w:val="18"/>
               </w:rPr>
-              <w:t>5</w:t>
+              <w:t>3</w:t>
             </w:r>
             <w:r>
               <w:rPr>
@@ -12866,7 +12893,7 @@
                 <w:sz w:val="18"/>
                 <w:szCs w:val="18"/>
               </w:rPr>
-              <w:t>5</w:t>
+              <w:t>3</w:t>
             </w:r>
             <w:r>
               <w:rPr>
@@ -13393,7 +13420,16 @@
                 <w:sz w:val="18"/>
                 <w:szCs w:val="18"/>
               </w:rPr>
-              <w:t>44</w:t>
+              <w:t>2</w:t>
+            </w:r>
+            <w:r>
+              <w:rPr>
+                <w:rFonts w:asciiTheme="minorEastAsia" w:hAnsiTheme="minorEastAsia" w:cs="Times New Roman"/>
+                <w:color w:val="000000"/>
+                <w:sz w:val="18"/>
+                <w:szCs w:val="18"/>
+              </w:rPr>
+              <w:t>8</w:t>
             </w:r>
           </w:p>
           <w:p>
@@ -13975,7 +14011,25 @@
                 <w:sz w:val="18"/>
                 <w:szCs w:val="18"/>
               </w:rPr>
-              <w:t>攻击52</w:t>
+              <w:t>攻击</w:t>
+            </w:r>
+            <w:r>
+              <w:rPr>
+                <w:rFonts w:asciiTheme="minorEastAsia" w:hAnsiTheme="minorEastAsia" w:cs="Times New Roman" w:hint="eastAsia"/>
+                <w:color w:val="000000"/>
+                <w:sz w:val="18"/>
+                <w:szCs w:val="18"/>
+              </w:rPr>
+              <w:t>7</w:t>
+            </w:r>
+            <w:r>
+              <w:rPr>
+                <w:rFonts w:asciiTheme="minorEastAsia" w:hAnsiTheme="minorEastAsia" w:cs="Times New Roman" w:hint="eastAsia"/>
+                <w:color w:val="000000"/>
+                <w:sz w:val="18"/>
+                <w:szCs w:val="18"/>
+              </w:rPr>
+              <w:t>2</w:t>
             </w:r>
             <w:r>
               <w:rPr>
@@ -14665,7 +14719,25 @@
                 <w:sz w:val="18"/>
                 <w:szCs w:val="18"/>
               </w:rPr>
-              <w:t>护甲/闪避：近战0</w:t>
+              <w:t>护甲/闪避：近战</w:t>
+            </w:r>
+            <w:r>
+              <w:rPr>
+                <w:rFonts w:asciiTheme="minorEastAsia" w:hAnsiTheme="minorEastAsia" w:cs="Times New Roman" w:hint="eastAsia"/>
+                <w:color w:val="000000"/>
+                <w:sz w:val="18"/>
+                <w:szCs w:val="18"/>
+              </w:rPr>
+              <w:t>4</w:t>
+            </w:r>
+            <w:r>
+              <w:rPr>
+                <w:rFonts w:asciiTheme="minorEastAsia" w:hAnsiTheme="minorEastAsia" w:cs="Times New Roman" w:hint="eastAsia"/>
+                <w:color w:val="000000"/>
+                <w:sz w:val="18"/>
+                <w:szCs w:val="18"/>
+              </w:rPr>
+              <w:t>0</w:t>
             </w:r>
             <w:r>
               <w:rPr>
@@ -14683,7 +14755,25 @@
                 <w:sz w:val="18"/>
                 <w:szCs w:val="18"/>
               </w:rPr>
-              <w:t>远程0</w:t>
+              <w:t>远程</w:t>
+            </w:r>
+            <w:r>
+              <w:rPr>
+                <w:rFonts w:asciiTheme="minorEastAsia" w:hAnsiTheme="minorEastAsia" w:cs="Times New Roman" w:hint="eastAsia"/>
+                <w:color w:val="000000"/>
+                <w:sz w:val="18"/>
+                <w:szCs w:val="18"/>
+              </w:rPr>
+              <w:t>4</w:t>
+            </w:r>
+            <w:r>
+              <w:rPr>
+                <w:rFonts w:asciiTheme="minorEastAsia" w:hAnsiTheme="minorEastAsia" w:cs="Times New Roman" w:hint="eastAsia"/>
+                <w:color w:val="000000"/>
+                <w:sz w:val="18"/>
+                <w:szCs w:val="18"/>
+              </w:rPr>
+              <w:t>0</w:t>
             </w:r>
             <w:r>
               <w:rPr>

</xml_diff>

<commit_message>
Sync up data for: polluteland
</commit_message>
<xml_diff>
--- a/兵种.docx
+++ b/兵种.docx
@@ -17507,7 +17507,16 @@
                 <w:sz w:val="18"/>
                 <w:szCs w:val="18"/>
               </w:rPr>
-              <w:t>80</w:t>
+              <w:t>6</w:t>
+            </w:r>
+            <w:r>
+              <w:rPr>
+                <w:rFonts w:asciiTheme="minorEastAsia" w:hAnsiTheme="minorEastAsia" w:cs="Times New Roman" w:hint="eastAsia"/>
+                <w:color w:val="000000"/>
+                <w:sz w:val="18"/>
+                <w:szCs w:val="18"/>
+              </w:rPr>
+              <w:t>0</w:t>
             </w:r>
             <w:r>
               <w:rPr>
@@ -17612,7 +17621,25 @@
                 <w:sz w:val="18"/>
                 <w:szCs w:val="18"/>
               </w:rPr>
-              <w:t>攻击24</w:t>
+              <w:t>攻击</w:t>
+            </w:r>
+            <w:r>
+              <w:rPr>
+                <w:rFonts w:asciiTheme="minorEastAsia" w:hAnsiTheme="minorEastAsia" w:cs="Times New Roman" w:hint="eastAsia"/>
+                <w:color w:val="000000"/>
+                <w:sz w:val="18"/>
+                <w:szCs w:val="18"/>
+              </w:rPr>
+              <w:t>1</w:t>
+            </w:r>
+            <w:r>
+              <w:rPr>
+                <w:rFonts w:asciiTheme="minorEastAsia" w:hAnsiTheme="minorEastAsia" w:cs="Times New Roman"/>
+                <w:color w:val="000000"/>
+                <w:sz w:val="18"/>
+                <w:szCs w:val="18"/>
+              </w:rPr>
+              <w:t>6</w:t>
             </w:r>
             <w:r>
               <w:rPr>
@@ -17657,7 +17684,16 @@
                 <w:sz w:val="18"/>
                 <w:szCs w:val="18"/>
               </w:rPr>
-              <w:t>80</w:t>
+              <w:t>4</w:t>
+            </w:r>
+            <w:r>
+              <w:rPr>
+                <w:rFonts w:asciiTheme="minorEastAsia" w:hAnsiTheme="minorEastAsia" w:cs="Times New Roman" w:hint="eastAsia"/>
+                <w:color w:val="000000"/>
+                <w:sz w:val="18"/>
+                <w:szCs w:val="18"/>
+              </w:rPr>
+              <w:t>0</w:t>
             </w:r>
           </w:p>
         </w:tc>
@@ -18140,7 +18176,16 @@
                 <w:sz w:val="18"/>
                 <w:szCs w:val="18"/>
               </w:rPr>
-              <w:t>80</w:t>
+              <w:t>6</w:t>
+            </w:r>
+            <w:r>
+              <w:rPr>
+                <w:rFonts w:asciiTheme="minorEastAsia" w:hAnsiTheme="minorEastAsia" w:cs="Times New Roman" w:hint="eastAsia"/>
+                <w:color w:val="000000"/>
+                <w:sz w:val="18"/>
+                <w:szCs w:val="18"/>
+              </w:rPr>
+              <w:t>0</w:t>
             </w:r>
             <w:r>
               <w:rPr>
@@ -18245,7 +18290,25 @@
                 <w:sz w:val="18"/>
                 <w:szCs w:val="18"/>
               </w:rPr>
-              <w:t>攻击36</w:t>
+              <w:t>攻击</w:t>
+            </w:r>
+            <w:r>
+              <w:rPr>
+                <w:rFonts w:asciiTheme="minorEastAsia" w:hAnsiTheme="minorEastAsia" w:cs="Times New Roman" w:hint="eastAsia"/>
+                <w:color w:val="000000"/>
+                <w:sz w:val="18"/>
+                <w:szCs w:val="18"/>
+              </w:rPr>
+              <w:t>5</w:t>
+            </w:r>
+            <w:r>
+              <w:rPr>
+                <w:rFonts w:asciiTheme="minorEastAsia" w:hAnsiTheme="minorEastAsia" w:cs="Times New Roman"/>
+                <w:color w:val="000000"/>
+                <w:sz w:val="18"/>
+                <w:szCs w:val="18"/>
+              </w:rPr>
+              <w:t>2</w:t>
             </w:r>
             <w:r>
               <w:rPr>
@@ -18320,7 +18383,25 @@
                 <w:sz w:val="18"/>
                 <w:szCs w:val="18"/>
               </w:rPr>
-              <w:t>攻击24</w:t>
+              <w:t>攻击</w:t>
+            </w:r>
+            <w:r>
+              <w:rPr>
+                <w:rFonts w:asciiTheme="minorEastAsia" w:hAnsiTheme="minorEastAsia" w:cs="Times New Roman" w:hint="eastAsia"/>
+                <w:color w:val="000000"/>
+                <w:sz w:val="18"/>
+                <w:szCs w:val="18"/>
+              </w:rPr>
+              <w:t>1</w:t>
+            </w:r>
+            <w:r>
+              <w:rPr>
+                <w:rFonts w:asciiTheme="minorEastAsia" w:hAnsiTheme="minorEastAsia" w:cs="Times New Roman"/>
+                <w:color w:val="000000"/>
+                <w:sz w:val="18"/>
+                <w:szCs w:val="18"/>
+              </w:rPr>
+              <w:t>6</w:t>
             </w:r>
             <w:r>
               <w:rPr>
@@ -18866,7 +18947,16 @@
                 <w:sz w:val="18"/>
                 <w:szCs w:val="18"/>
               </w:rPr>
-              <w:t>80</w:t>
+              <w:t>6</w:t>
+            </w:r>
+            <w:r>
+              <w:rPr>
+                <w:rFonts w:asciiTheme="minorEastAsia" w:hAnsiTheme="minorEastAsia" w:cs="Times New Roman" w:hint="eastAsia"/>
+                <w:color w:val="000000"/>
+                <w:sz w:val="18"/>
+                <w:szCs w:val="18"/>
+              </w:rPr>
+              <w:t>0</w:t>
             </w:r>
             <w:r>
               <w:rPr>
@@ -18975,12 +19065,12 @@
             </w:r>
             <w:r>
               <w:rPr>
-                <w:rFonts w:asciiTheme="minorEastAsia" w:hAnsiTheme="minorEastAsia" w:cs="Times New Roman" w:hint="eastAsia"/>
-                <w:color w:val="000000"/>
-                <w:sz w:val="18"/>
-                <w:szCs w:val="18"/>
-              </w:rPr>
-              <w:t>2</w:t>
+                <w:rFonts w:asciiTheme="minorEastAsia" w:hAnsiTheme="minorEastAsia" w:cs="Times New Roman"/>
+                <w:color w:val="000000"/>
+                <w:sz w:val="18"/>
+                <w:szCs w:val="18"/>
+              </w:rPr>
+              <w:t>0</w:t>
             </w:r>
             <w:r>
               <w:rPr>
@@ -19613,7 +19703,25 @@
                 <w:sz w:val="18"/>
                 <w:szCs w:val="18"/>
               </w:rPr>
-              <w:t>攻击60</w:t>
+              <w:t>攻击</w:t>
+            </w:r>
+            <w:r>
+              <w:rPr>
+                <w:rFonts w:asciiTheme="minorEastAsia" w:hAnsiTheme="minorEastAsia" w:cs="Times New Roman" w:hint="eastAsia"/>
+                <w:color w:val="000000"/>
+                <w:sz w:val="18"/>
+                <w:szCs w:val="18"/>
+              </w:rPr>
+              <w:t>8</w:t>
+            </w:r>
+            <w:r>
+              <w:rPr>
+                <w:rFonts w:asciiTheme="minorEastAsia" w:hAnsiTheme="minorEastAsia" w:cs="Times New Roman" w:hint="eastAsia"/>
+                <w:color w:val="000000"/>
+                <w:sz w:val="18"/>
+                <w:szCs w:val="18"/>
+              </w:rPr>
+              <w:t>0</w:t>
             </w:r>
             <w:r>
               <w:rPr>
@@ -19794,7 +19902,25 @@
                 <w:sz w:val="18"/>
                 <w:szCs w:val="18"/>
               </w:rPr>
-              <w:t>护甲/闪避：近战0</w:t>
+              <w:t>护甲/闪避：近战</w:t>
+            </w:r>
+            <w:r>
+              <w:rPr>
+                <w:rFonts w:asciiTheme="minorEastAsia" w:hAnsiTheme="minorEastAsia" w:cs="Times New Roman" w:hint="eastAsia"/>
+                <w:color w:val="000000"/>
+                <w:sz w:val="18"/>
+                <w:szCs w:val="18"/>
+              </w:rPr>
+              <w:t>3</w:t>
+            </w:r>
+            <w:r>
+              <w:rPr>
+                <w:rFonts w:asciiTheme="minorEastAsia" w:hAnsiTheme="minorEastAsia" w:cs="Times New Roman" w:hint="eastAsia"/>
+                <w:color w:val="000000"/>
+                <w:sz w:val="18"/>
+                <w:szCs w:val="18"/>
+              </w:rPr>
+              <w:t>0</w:t>
             </w:r>
             <w:r>
               <w:rPr>
@@ -20312,7 +20438,16 @@
                 <w:sz w:val="18"/>
                 <w:szCs w:val="18"/>
               </w:rPr>
-              <w:t>52</w:t>
+              <w:t>8</w:t>
+            </w:r>
+            <w:r>
+              <w:rPr>
+                <w:rFonts w:asciiTheme="minorEastAsia" w:hAnsiTheme="minorEastAsia" w:cs="Times New Roman"/>
+                <w:color w:val="000000"/>
+                <w:sz w:val="18"/>
+                <w:szCs w:val="18"/>
+              </w:rPr>
+              <w:t>8</w:t>
             </w:r>
             <w:r>
               <w:rPr>
@@ -20529,7 +20664,25 @@
                 <w:sz w:val="18"/>
                 <w:szCs w:val="18"/>
               </w:rPr>
-              <w:t>护甲/闪避：近战0</w:t>
+              <w:t>护甲/闪避：近战</w:t>
+            </w:r>
+            <w:r>
+              <w:rPr>
+                <w:rFonts w:asciiTheme="minorEastAsia" w:hAnsiTheme="minorEastAsia" w:cs="Times New Roman" w:hint="eastAsia"/>
+                <w:color w:val="000000"/>
+                <w:sz w:val="18"/>
+                <w:szCs w:val="18"/>
+              </w:rPr>
+              <w:t>3</w:t>
+            </w:r>
+            <w:r>
+              <w:rPr>
+                <w:rFonts w:asciiTheme="minorEastAsia" w:hAnsiTheme="minorEastAsia" w:cs="Times New Roman" w:hint="eastAsia"/>
+                <w:color w:val="000000"/>
+                <w:sz w:val="18"/>
+                <w:szCs w:val="18"/>
+              </w:rPr>
+              <w:t>0</w:t>
             </w:r>
             <w:r>
               <w:rPr>
@@ -20652,7 +20805,7 @@
               <w:widowControl/>
               <w:jc w:val="left"/>
               <w:rPr>
-                <w:rFonts w:asciiTheme="minorEastAsia" w:hAnsiTheme="minorEastAsia" w:cs="Times New Roman"/>
+                <w:rFonts w:asciiTheme="minorEastAsia" w:hAnsiTheme="minorEastAsia" w:cs="Times New Roman" w:hint="eastAsia"/>
                 <w:color w:val="000000"/>
                 <w:sz w:val="18"/>
                 <w:szCs w:val="18"/>
@@ -20674,7 +20827,7 @@
                 <w:sz w:val="18"/>
                 <w:szCs w:val="18"/>
               </w:rPr>
-              <w:t>2</w:t>
+              <w:t>3</w:t>
             </w:r>
           </w:p>
         </w:tc>
@@ -21047,7 +21200,16 @@
                 <w:sz w:val="18"/>
                 <w:szCs w:val="18"/>
               </w:rPr>
-              <w:t>攻击6</w:t>
+              <w:t>攻击</w:t>
+            </w:r>
+            <w:r>
+              <w:rPr>
+                <w:rFonts w:asciiTheme="minorEastAsia" w:hAnsiTheme="minorEastAsia" w:cs="Times New Roman" w:hint="eastAsia"/>
+                <w:color w:val="000000"/>
+                <w:sz w:val="18"/>
+                <w:szCs w:val="18"/>
+              </w:rPr>
+              <w:t>7</w:t>
             </w:r>
             <w:r>
               <w:rPr>
@@ -21228,7 +21390,25 @@
                 <w:sz w:val="18"/>
                 <w:szCs w:val="18"/>
               </w:rPr>
-              <w:t>护甲/闪避：近战0</w:t>
+              <w:t>护甲/闪避：近战</w:t>
+            </w:r>
+            <w:r>
+              <w:rPr>
+                <w:rFonts w:asciiTheme="minorEastAsia" w:hAnsiTheme="minorEastAsia" w:cs="Times New Roman" w:hint="eastAsia"/>
+                <w:color w:val="000000"/>
+                <w:sz w:val="18"/>
+                <w:szCs w:val="18"/>
+              </w:rPr>
+              <w:t>3</w:t>
+            </w:r>
+            <w:r>
+              <w:rPr>
+                <w:rFonts w:asciiTheme="minorEastAsia" w:hAnsiTheme="minorEastAsia" w:cs="Times New Roman" w:hint="eastAsia"/>
+                <w:color w:val="000000"/>
+                <w:sz w:val="18"/>
+                <w:szCs w:val="18"/>
+              </w:rPr>
+              <w:t>0</w:t>
             </w:r>
             <w:r>
               <w:rPr>
@@ -21759,7 +21939,7 @@
                 <w:sz w:val="18"/>
                 <w:szCs w:val="18"/>
               </w:rPr>
-              <w:t>6</w:t>
+              <w:t>7</w:t>
             </w:r>
             <w:r>
               <w:rPr>
@@ -22222,7 +22402,25 @@
                 <w:sz w:val="18"/>
                 <w:szCs w:val="18"/>
               </w:rPr>
-              <w:t>200</w:t>
+              <w:t>2</w:t>
+            </w:r>
+            <w:r>
+              <w:rPr>
+                <w:rFonts w:asciiTheme="minorEastAsia" w:hAnsiTheme="minorEastAsia" w:cs="Times New Roman"/>
+                <w:color w:val="000000"/>
+                <w:sz w:val="18"/>
+                <w:szCs w:val="18"/>
+              </w:rPr>
+              <w:t>4</w:t>
+            </w:r>
+            <w:r>
+              <w:rPr>
+                <w:rFonts w:asciiTheme="minorEastAsia" w:hAnsiTheme="minorEastAsia" w:cs="Times New Roman" w:hint="eastAsia"/>
+                <w:color w:val="000000"/>
+                <w:sz w:val="18"/>
+                <w:szCs w:val="18"/>
+              </w:rPr>
+              <w:t>0</w:t>
             </w:r>
             <w:r>
               <w:rPr>
@@ -22240,7 +22438,16 @@
                 <w:sz w:val="18"/>
                 <w:szCs w:val="18"/>
               </w:rPr>
-              <w:t>范围11</w:t>
+              <w:t>范围1</w:t>
+            </w:r>
+            <w:r>
+              <w:rPr>
+                <w:rFonts w:asciiTheme="minorEastAsia" w:hAnsiTheme="minorEastAsia" w:cs="Times New Roman"/>
+                <w:color w:val="000000"/>
+                <w:sz w:val="18"/>
+                <w:szCs w:val="18"/>
+              </w:rPr>
+              <w:t>0</w:t>
             </w:r>
           </w:p>
         </w:tc>

</xml_diff>

<commit_message>
Sync up data for: snowhaupt
</commit_message>
<xml_diff>
--- a/兵种.docx
+++ b/兵种.docx
@@ -260,7 +260,7 @@
               <w:widowControl/>
               <w:jc w:val="left"/>
               <w:rPr>
-                <w:rFonts w:asciiTheme="minorEastAsia" w:hAnsiTheme="minorEastAsia" w:cs="Times New Roman"/>
+                <w:rFonts w:asciiTheme="minorEastAsia" w:hAnsiTheme="minorEastAsia" w:cs="Times New Roman" w:hint="eastAsia"/>
                 <w:color w:val="000000"/>
                 <w:sz w:val="18"/>
                 <w:szCs w:val="18"/>
@@ -291,7 +291,7 @@
                 <w:sz w:val="18"/>
                 <w:szCs w:val="18"/>
               </w:rPr>
-              <w:t>2</w:t>
+              <w:t>6</w:t>
             </w:r>
             <w:r>
               <w:rPr>
@@ -345,34 +345,7 @@
                 <w:sz w:val="18"/>
                 <w:szCs w:val="18"/>
               </w:rPr>
-              <w:t xml:space="preserve">近战 </w:t>
-            </w:r>
-            <w:r>
-              <w:rPr>
-                <w:rFonts w:asciiTheme="minorEastAsia" w:hAnsiTheme="minorEastAsia" w:cs="Times New Roman"/>
-                <w:color w:val="000000"/>
-                <w:sz w:val="18"/>
-                <w:szCs w:val="18"/>
-              </w:rPr>
-              <w:t xml:space="preserve"> </w:t>
-            </w:r>
-            <w:r>
-              <w:rPr>
-                <w:rFonts w:asciiTheme="minorEastAsia" w:hAnsiTheme="minorEastAsia" w:cs="Times New Roman" w:hint="eastAsia"/>
-                <w:color w:val="000000"/>
-                <w:sz w:val="18"/>
-                <w:szCs w:val="18"/>
-              </w:rPr>
-              <w:t>破甲</w:t>
-            </w:r>
-            <w:r>
-              <w:rPr>
-                <w:rFonts w:asciiTheme="minorEastAsia" w:hAnsiTheme="minorEastAsia" w:cs="Times New Roman" w:hint="eastAsia"/>
-                <w:color w:val="000000"/>
-                <w:sz w:val="18"/>
-                <w:szCs w:val="18"/>
-              </w:rPr>
-              <w:t>8</w:t>
+              <w:t>近战</w:t>
             </w:r>
           </w:p>
           <w:p>
@@ -1153,6 +1126,15 @@
                 <w:szCs w:val="18"/>
               </w:rPr>
               <w:t>破甲</w:t>
+            </w:r>
+            <w:r>
+              <w:rPr>
+                <w:rFonts w:asciiTheme="minorEastAsia" w:hAnsiTheme="minorEastAsia" w:cs="Times New Roman" w:hint="eastAsia"/>
+                <w:color w:val="000000"/>
+                <w:sz w:val="18"/>
+                <w:szCs w:val="18"/>
+              </w:rPr>
+              <w:t>1</w:t>
             </w:r>
             <w:r>
               <w:rPr>
@@ -23918,7 +23900,7 @@
                 <w:sz w:val="18"/>
                 <w:szCs w:val="18"/>
               </w:rPr>
-              <w:t>6</w:t>
+              <w:t>8</w:t>
             </w:r>
             <w:r>
               <w:rPr>
@@ -24162,7 +24144,7 @@
                 <w:sz w:val="18"/>
                 <w:szCs w:val="18"/>
               </w:rPr>
-              <w:t>3</w:t>
+              <w:t>2</w:t>
             </w:r>
             <w:r>
               <w:rPr>
@@ -24675,7 +24657,25 @@
                 <w:sz w:val="18"/>
                 <w:szCs w:val="18"/>
               </w:rPr>
-              <w:t>护甲/闪避：近战0</w:t>
+              <w:t>护甲/闪避：近战</w:t>
+            </w:r>
+            <w:r>
+              <w:rPr>
+                <w:rFonts w:asciiTheme="minorEastAsia" w:hAnsiTheme="minorEastAsia" w:cs="Times New Roman" w:hint="eastAsia"/>
+                <w:color w:val="000000"/>
+                <w:sz w:val="18"/>
+                <w:szCs w:val="18"/>
+              </w:rPr>
+              <w:t>4</w:t>
+            </w:r>
+            <w:r>
+              <w:rPr>
+                <w:rFonts w:asciiTheme="minorEastAsia" w:hAnsiTheme="minorEastAsia" w:cs="Times New Roman" w:hint="eastAsia"/>
+                <w:color w:val="000000"/>
+                <w:sz w:val="18"/>
+                <w:szCs w:val="18"/>
+              </w:rPr>
+              <w:t>0</w:t>
             </w:r>
             <w:r>
               <w:rPr>
@@ -24693,7 +24693,25 @@
                 <w:sz w:val="18"/>
                 <w:szCs w:val="18"/>
               </w:rPr>
-              <w:t>远程0</w:t>
+              <w:t>远程</w:t>
+            </w:r>
+            <w:r>
+              <w:rPr>
+                <w:rFonts w:asciiTheme="minorEastAsia" w:hAnsiTheme="minorEastAsia" w:cs="Times New Roman" w:hint="eastAsia"/>
+                <w:color w:val="000000"/>
+                <w:sz w:val="18"/>
+                <w:szCs w:val="18"/>
+              </w:rPr>
+              <w:t>2</w:t>
+            </w:r>
+            <w:r>
+              <w:rPr>
+                <w:rFonts w:asciiTheme="minorEastAsia" w:hAnsiTheme="minorEastAsia" w:cs="Times New Roman" w:hint="eastAsia"/>
+                <w:color w:val="000000"/>
+                <w:sz w:val="18"/>
+                <w:szCs w:val="18"/>
+              </w:rPr>
+              <w:t>0</w:t>
             </w:r>
             <w:r>
               <w:rPr>
@@ -24720,7 +24738,25 @@
                 <w:sz w:val="18"/>
                 <w:szCs w:val="18"/>
               </w:rPr>
-              <w:t>冲杀0</w:t>
+              <w:t>冲杀</w:t>
+            </w:r>
+            <w:r>
+              <w:rPr>
+                <w:rFonts w:asciiTheme="minorEastAsia" w:hAnsiTheme="minorEastAsia" w:cs="Times New Roman" w:hint="eastAsia"/>
+                <w:color w:val="000000"/>
+                <w:sz w:val="18"/>
+                <w:szCs w:val="18"/>
+              </w:rPr>
+              <w:t>2</w:t>
+            </w:r>
+            <w:r>
+              <w:rPr>
+                <w:rFonts w:asciiTheme="minorEastAsia" w:hAnsiTheme="minorEastAsia" w:cs="Times New Roman" w:hint="eastAsia"/>
+                <w:color w:val="000000"/>
+                <w:sz w:val="18"/>
+                <w:szCs w:val="18"/>
+              </w:rPr>
+              <w:t>0</w:t>
             </w:r>
           </w:p>
         </w:tc>
@@ -25227,25 +25263,7 @@
                 <w:sz w:val="18"/>
                 <w:szCs w:val="18"/>
               </w:rPr>
-              <w:t>护甲/闪避：近战</w:t>
-            </w:r>
-            <w:r>
-              <w:rPr>
-                <w:rFonts w:asciiTheme="minorEastAsia" w:hAnsiTheme="minorEastAsia" w:cs="Times New Roman" w:hint="eastAsia"/>
-                <w:color w:val="000000"/>
-                <w:sz w:val="18"/>
-                <w:szCs w:val="18"/>
-              </w:rPr>
-              <w:t>3</w:t>
-            </w:r>
-            <w:r>
-              <w:rPr>
-                <w:rFonts w:asciiTheme="minorEastAsia" w:hAnsiTheme="minorEastAsia" w:cs="Times New Roman" w:hint="eastAsia"/>
-                <w:color w:val="000000"/>
-                <w:sz w:val="18"/>
-                <w:szCs w:val="18"/>
-              </w:rPr>
-              <w:t>0</w:t>
+              <w:t>护甲/闪避：近战0</w:t>
             </w:r>
             <w:r>
               <w:rPr>
@@ -25272,7 +25290,7 @@
                 <w:sz w:val="18"/>
                 <w:szCs w:val="18"/>
               </w:rPr>
-              <w:t>9</w:t>
+              <w:t>8</w:t>
             </w:r>
             <w:r>
               <w:rPr>
@@ -26273,7 +26291,16 @@
                 <w:sz w:val="18"/>
                 <w:szCs w:val="18"/>
               </w:rPr>
-              <w:t>32</w:t>
+              <w:t>3</w:t>
+            </w:r>
+            <w:r>
+              <w:rPr>
+                <w:rFonts w:asciiTheme="minorEastAsia" w:hAnsiTheme="minorEastAsia" w:cs="Times New Roman"/>
+                <w:color w:val="000000"/>
+                <w:sz w:val="18"/>
+                <w:szCs w:val="18"/>
+              </w:rPr>
+              <w:t>6</w:t>
             </w:r>
             <w:r>
               <w:rPr>
@@ -26423,7 +26450,7 @@
                 <w:sz w:val="18"/>
                 <w:szCs w:val="18"/>
               </w:rPr>
-              <w:t>4</w:t>
+              <w:t>6</w:t>
             </w:r>
           </w:p>
         </w:tc>

</xml_diff>